<commit_message>
docs(asm): asm1.docx đầy đủ theo mẫu tham chiếu (bìa, mục lục, lý thuyết Agile/Scrum, User Story + tiêu chí nghiệm thu, demo, biên bản họp, nhật ký cập nhật)
Bổ sung các mục còn thiếu so với ref Nhom7: trang bìa + mục lục, CHƯƠNG lý thuyết
Agile/Scrum, bảng User Story 40 dòng có Acceptance Criteria, giới thiệu Demo,
biên bản nhận xét thành viên (3 buổi), nhật ký cập nhật, biên bản họp Sprint Planning.
verify_docx PASS cả 3 file, không có gạch ngang dài. WS1/WS2 độc lập cũng cập nhật theo.

Co-Authored-By: Claude Opus 4.8 (1M context) <noreply@anthropic.com>
</commit_message>
<xml_diff>
--- a/doc-school/WORKSHOP_2_MucTieu_BShoes.docx
+++ b/doc-school/WORKSHOP_2_MucTieu_BShoes.docx
@@ -5,32 +5,478 @@
     <w:p>
       <w:pPr>
         <w:spacing w:lineRule="auto" w:line="312" w:after="120"/>
-        <w:ind w:left="0"/>
         <w:jc w:val="center"/>
       </w:pPr>
       <w:r>
         <w:rPr>
           <w:rFonts w:ascii="Times New Roman" w:hAnsi="Times New Roman" w:eastAsia="Times New Roman"/>
           <w:b/>
+          <w:i w:val="0"/>
           <w:color w:val="0B895A"/>
-          <w:sz w:val="36"/>
+          <w:sz w:val="30"/>
         </w:rPr>
-        <w:t>WORKSHOP 2: MỤC TIÊU VÀ ƯỚC LƯỢNG</w:t>
+        <w:t>TRƯỜNG ĐẠI HỌC</w:t>
       </w:r>
     </w:p>
     <w:p>
       <w:pPr>
         <w:spacing w:lineRule="auto" w:line="312" w:after="120"/>
-        <w:ind w:left="0"/>
         <w:jc w:val="center"/>
       </w:pPr>
       <w:r>
         <w:rPr>
           <w:rFonts w:ascii="Times New Roman" w:hAnsi="Times New Roman" w:eastAsia="Times New Roman"/>
+          <w:b/>
+          <w:i w:val="0"/>
+          <w:color w:val="0B895A"/>
+          <w:sz w:val="28"/>
+        </w:rPr>
+        <w:t>KHOA CÔNG NGHỆ THÔNG TIN</w:t>
+      </w:r>
+    </w:p>
+    <w:p/>
+    <w:p/>
+    <w:p>
+      <w:pPr>
+        <w:spacing w:lineRule="auto" w:line="312" w:after="120"/>
+        <w:jc w:val="center"/>
+      </w:pPr>
+      <w:r>
+        <w:rPr>
+          <w:rFonts w:ascii="Times New Roman" w:hAnsi="Times New Roman" w:eastAsia="Times New Roman"/>
+          <w:b/>
+          <w:i w:val="0"/>
+          <w:color w:val="0B895A"/>
+          <w:sz w:val="40"/>
+        </w:rPr>
+        <w:t>BÁO CÁO</w:t>
+      </w:r>
+    </w:p>
+    <w:p>
+      <w:pPr>
+        <w:spacing w:lineRule="auto" w:line="312" w:after="120"/>
+        <w:jc w:val="center"/>
+      </w:pPr>
+      <w:r>
+        <w:rPr>
+          <w:rFonts w:ascii="Times New Roman" w:hAnsi="Times New Roman" w:eastAsia="Times New Roman"/>
+          <w:b/>
+          <w:i w:val="0"/>
+          <w:color w:val="0B895A"/>
+          <w:sz w:val="34"/>
+        </w:rPr>
+        <w:t>WORKSHOP 2: MỤC TIÊU, ƯỚC LƯỢNG VÀ SPRINT BACKLOG</w:t>
+      </w:r>
+    </w:p>
+    <w:p>
+      <w:pPr>
+        <w:spacing w:lineRule="auto" w:line="312" w:after="120"/>
+        <w:jc w:val="center"/>
+      </w:pPr>
+      <w:r>
+        <w:rPr>
+          <w:rFonts w:ascii="Times New Roman" w:hAnsi="Times New Roman" w:eastAsia="Times New Roman"/>
+          <w:b/>
+          <w:i w:val="0"/>
+          <w:sz w:val="28"/>
+        </w:rPr>
+        <w:t>MÔN HỌC: AGILE &amp; SCRUM</w:t>
+      </w:r>
+    </w:p>
+    <w:p/>
+    <w:p>
+      <w:pPr>
+        <w:spacing w:lineRule="auto" w:line="312" w:after="120"/>
+        <w:jc w:val="center"/>
+      </w:pPr>
+      <w:r>
+        <w:rPr>
+          <w:rFonts w:ascii="Times New Roman" w:hAnsi="Times New Roman" w:eastAsia="Times New Roman"/>
+          <w:b/>
+          <w:i w:val="0"/>
+          <w:sz w:val="28"/>
+        </w:rPr>
+        <w:t>DỰ ÁN</w:t>
+      </w:r>
+    </w:p>
+    <w:p>
+      <w:pPr>
+        <w:spacing w:lineRule="auto" w:line="312" w:after="120"/>
+        <w:jc w:val="center"/>
+      </w:pPr>
+      <w:r>
+        <w:rPr>
+          <w:rFonts w:ascii="Times New Roman" w:hAnsi="Times New Roman" w:eastAsia="Times New Roman"/>
+          <w:b/>
+          <w:i/>
+          <w:sz w:val="28"/>
+        </w:rPr>
+        <w:t>BShoes - Phần mềm quản lý cửa hàng giày</w:t>
+      </w:r>
+    </w:p>
+    <w:p/>
+    <w:p/>
+    <w:tbl>
+      <w:tblPr>
+        <w:tblStyle w:val="TableGrid"/>
+        <w:tblW w:type="auto" w:w="0"/>
+        <w:jc w:val="center"/>
+        <w:tblLook w:firstColumn="1" w:firstRow="1" w:lastColumn="0" w:lastRow="0" w:noHBand="0" w:noVBand="1" w:val="04A0"/>
+      </w:tblPr>
+      <w:tblGrid>
+        <w:gridCol w:w="3324"/>
+        <w:gridCol w:w="3324"/>
+        <w:gridCol w:w="3324"/>
+      </w:tblGrid>
+      <w:tr>
+        <w:tc>
+          <w:tcPr>
+            <w:tcW w:type="dxa" w:w="3324"/>
+          </w:tcPr>
+          <w:p>
+            <w:pPr>
+              <w:jc w:val="center"/>
+            </w:pPr>
+            <w:r/>
+            <w:r>
+              <w:rPr>
+                <w:rFonts w:ascii="Times New Roman" w:hAnsi="Times New Roman" w:eastAsia="Times New Roman"/>
+                <w:b/>
+                <w:i w:val="0"/>
+                <w:color w:val="0B895A"/>
+                <w:sz w:val="26"/>
+              </w:rPr>
+              <w:t>STT</w:t>
+            </w:r>
+          </w:p>
+        </w:tc>
+        <w:tc>
+          <w:tcPr>
+            <w:tcW w:type="dxa" w:w="3324"/>
+          </w:tcPr>
+          <w:p>
+            <w:pPr>
+              <w:jc w:val="center"/>
+            </w:pPr>
+            <w:r/>
+            <w:r>
+              <w:rPr>
+                <w:rFonts w:ascii="Times New Roman" w:hAnsi="Times New Roman" w:eastAsia="Times New Roman"/>
+                <w:b/>
+                <w:i w:val="0"/>
+                <w:color w:val="0B895A"/>
+                <w:sz w:val="26"/>
+              </w:rPr>
+              <w:t>Họ và tên</w:t>
+            </w:r>
+          </w:p>
+        </w:tc>
+        <w:tc>
+          <w:tcPr>
+            <w:tcW w:type="dxa" w:w="3324"/>
+          </w:tcPr>
+          <w:p>
+            <w:pPr>
+              <w:jc w:val="center"/>
+            </w:pPr>
+            <w:r/>
+            <w:r>
+              <w:rPr>
+                <w:rFonts w:ascii="Times New Roman" w:hAnsi="Times New Roman" w:eastAsia="Times New Roman"/>
+                <w:b/>
+                <w:i w:val="0"/>
+                <w:color w:val="0B895A"/>
+                <w:sz w:val="26"/>
+              </w:rPr>
+              <w:t>Vai trò</w:t>
+            </w:r>
+          </w:p>
+        </w:tc>
+      </w:tr>
+      <w:tr>
+        <w:tc>
+          <w:tcPr>
+            <w:tcW w:type="dxa" w:w="3324"/>
+          </w:tcPr>
+          <w:p>
+            <w:pPr>
+              <w:jc w:val="center"/>
+            </w:pPr>
+            <w:r/>
+            <w:r>
+              <w:rPr>
+                <w:rFonts w:ascii="Times New Roman" w:hAnsi="Times New Roman" w:eastAsia="Times New Roman"/>
+                <w:b w:val="0"/>
+                <w:i w:val="0"/>
+                <w:sz w:val="26"/>
+              </w:rPr>
+              <w:t>1</w:t>
+            </w:r>
+          </w:p>
+        </w:tc>
+        <w:tc>
+          <w:tcPr>
+            <w:tcW w:type="dxa" w:w="3324"/>
+          </w:tcPr>
+          <w:p>
+            <w:pPr>
+              <w:jc w:val="center"/>
+            </w:pPr>
+            <w:r/>
+            <w:r>
+              <w:rPr>
+                <w:rFonts w:ascii="Times New Roman" w:hAnsi="Times New Roman" w:eastAsia="Times New Roman"/>
+                <w:b w:val="0"/>
+                <w:i w:val="0"/>
+                <w:sz w:val="26"/>
+              </w:rPr>
+              <w:t>Nguyễn Đình Dũng</w:t>
+            </w:r>
+          </w:p>
+        </w:tc>
+        <w:tc>
+          <w:tcPr>
+            <w:tcW w:type="dxa" w:w="3324"/>
+          </w:tcPr>
+          <w:p>
+            <w:pPr>
+              <w:jc w:val="center"/>
+            </w:pPr>
+            <w:r/>
+            <w:r>
+              <w:rPr>
+                <w:rFonts w:ascii="Times New Roman" w:hAnsi="Times New Roman" w:eastAsia="Times New Roman"/>
+                <w:b w:val="0"/>
+                <w:i w:val="0"/>
+                <w:sz w:val="26"/>
+              </w:rPr>
+              <w:t>Product Owner (PO)</w:t>
+            </w:r>
+          </w:p>
+        </w:tc>
+      </w:tr>
+      <w:tr>
+        <w:tc>
+          <w:tcPr>
+            <w:tcW w:type="dxa" w:w="3324"/>
+          </w:tcPr>
+          <w:p>
+            <w:pPr>
+              <w:jc w:val="center"/>
+            </w:pPr>
+            <w:r/>
+            <w:r>
+              <w:rPr>
+                <w:rFonts w:ascii="Times New Roman" w:hAnsi="Times New Roman" w:eastAsia="Times New Roman"/>
+                <w:b w:val="0"/>
+                <w:i w:val="0"/>
+                <w:sz w:val="26"/>
+              </w:rPr>
+              <w:t>2</w:t>
+            </w:r>
+          </w:p>
+        </w:tc>
+        <w:tc>
+          <w:tcPr>
+            <w:tcW w:type="dxa" w:w="3324"/>
+          </w:tcPr>
+          <w:p>
+            <w:pPr>
+              <w:jc w:val="center"/>
+            </w:pPr>
+            <w:r/>
+            <w:r>
+              <w:rPr>
+                <w:rFonts w:ascii="Times New Roman" w:hAnsi="Times New Roman" w:eastAsia="Times New Roman"/>
+                <w:b w:val="0"/>
+                <w:i w:val="0"/>
+                <w:sz w:val="26"/>
+              </w:rPr>
+              <w:t>Hoàng Lê Bảo Ngọc</w:t>
+            </w:r>
+          </w:p>
+        </w:tc>
+        <w:tc>
+          <w:tcPr>
+            <w:tcW w:type="dxa" w:w="3324"/>
+          </w:tcPr>
+          <w:p>
+            <w:pPr>
+              <w:jc w:val="center"/>
+            </w:pPr>
+            <w:r/>
+            <w:r>
+              <w:rPr>
+                <w:rFonts w:ascii="Times New Roman" w:hAnsi="Times New Roman" w:eastAsia="Times New Roman"/>
+                <w:b w:val="0"/>
+                <w:i w:val="0"/>
+                <w:sz w:val="26"/>
+              </w:rPr>
+              <w:t>Scrum Master (SM)</w:t>
+            </w:r>
+          </w:p>
+        </w:tc>
+      </w:tr>
+      <w:tr>
+        <w:tc>
+          <w:tcPr>
+            <w:tcW w:type="dxa" w:w="3324"/>
+          </w:tcPr>
+          <w:p>
+            <w:pPr>
+              <w:jc w:val="center"/>
+            </w:pPr>
+            <w:r/>
+            <w:r>
+              <w:rPr>
+                <w:rFonts w:ascii="Times New Roman" w:hAnsi="Times New Roman" w:eastAsia="Times New Roman"/>
+                <w:b w:val="0"/>
+                <w:i w:val="0"/>
+                <w:sz w:val="26"/>
+              </w:rPr>
+              <w:t>3</w:t>
+            </w:r>
+          </w:p>
+        </w:tc>
+        <w:tc>
+          <w:tcPr>
+            <w:tcW w:type="dxa" w:w="3324"/>
+          </w:tcPr>
+          <w:p>
+            <w:pPr>
+              <w:jc w:val="center"/>
+            </w:pPr>
+            <w:r/>
+            <w:r>
+              <w:rPr>
+                <w:rFonts w:ascii="Times New Roman" w:hAnsi="Times New Roman" w:eastAsia="Times New Roman"/>
+                <w:b w:val="0"/>
+                <w:i w:val="0"/>
+                <w:sz w:val="26"/>
+              </w:rPr>
+              <w:t>Lưu Đình Bắc</w:t>
+            </w:r>
+          </w:p>
+        </w:tc>
+        <w:tc>
+          <w:tcPr>
+            <w:tcW w:type="dxa" w:w="3324"/>
+          </w:tcPr>
+          <w:p>
+            <w:pPr>
+              <w:jc w:val="center"/>
+            </w:pPr>
+            <w:r/>
+            <w:r>
+              <w:rPr>
+                <w:rFonts w:ascii="Times New Roman" w:hAnsi="Times New Roman" w:eastAsia="Times New Roman"/>
+                <w:b w:val="0"/>
+                <w:i w:val="0"/>
+                <w:sz w:val="26"/>
+              </w:rPr>
+              <w:t>Developer (DEV)</w:t>
+            </w:r>
+          </w:p>
+        </w:tc>
+      </w:tr>
+      <w:tr>
+        <w:tc>
+          <w:tcPr>
+            <w:tcW w:type="dxa" w:w="3324"/>
+          </w:tcPr>
+          <w:p>
+            <w:pPr>
+              <w:jc w:val="center"/>
+            </w:pPr>
+            <w:r/>
+            <w:r>
+              <w:rPr>
+                <w:rFonts w:ascii="Times New Roman" w:hAnsi="Times New Roman" w:eastAsia="Times New Roman"/>
+                <w:b w:val="0"/>
+                <w:i w:val="0"/>
+                <w:sz w:val="26"/>
+              </w:rPr>
+              <w:t>4</w:t>
+            </w:r>
+          </w:p>
+        </w:tc>
+        <w:tc>
+          <w:tcPr>
+            <w:tcW w:type="dxa" w:w="3324"/>
+          </w:tcPr>
+          <w:p>
+            <w:pPr>
+              <w:jc w:val="center"/>
+            </w:pPr>
+            <w:r/>
+            <w:r>
+              <w:rPr>
+                <w:rFonts w:ascii="Times New Roman" w:hAnsi="Times New Roman" w:eastAsia="Times New Roman"/>
+                <w:b w:val="0"/>
+                <w:i w:val="0"/>
+                <w:sz w:val="26"/>
+              </w:rPr>
+              <w:t>Đỗ Anh Vũ</w:t>
+            </w:r>
+          </w:p>
+        </w:tc>
+        <w:tc>
+          <w:tcPr>
+            <w:tcW w:type="dxa" w:w="3324"/>
+          </w:tcPr>
+          <w:p>
+            <w:pPr>
+              <w:jc w:val="center"/>
+            </w:pPr>
+            <w:r/>
+            <w:r>
+              <w:rPr>
+                <w:rFonts w:ascii="Times New Roman" w:hAnsi="Times New Roman" w:eastAsia="Times New Roman"/>
+                <w:b w:val="0"/>
+                <w:i w:val="0"/>
+                <w:sz w:val="26"/>
+              </w:rPr>
+              <w:t>Developer (DEV)</w:t>
+            </w:r>
+          </w:p>
+        </w:tc>
+      </w:tr>
+    </w:tbl>
+    <w:p/>
+    <w:p/>
+    <w:p>
+      <w:pPr>
+        <w:spacing w:lineRule="auto" w:line="312" w:after="120"/>
+        <w:jc w:val="center"/>
+      </w:pPr>
+      <w:r>
+        <w:rPr>
+          <w:rFonts w:ascii="Times New Roman" w:hAnsi="Times New Roman" w:eastAsia="Times New Roman"/>
+          <w:b/>
+          <w:i w:val="0"/>
+          <w:sz w:val="28"/>
+        </w:rPr>
+        <w:t>NHÓM 1</w:t>
+      </w:r>
+    </w:p>
+    <w:p>
+      <w:pPr>
+        <w:spacing w:lineRule="auto" w:line="312" w:after="120"/>
+        <w:jc w:val="center"/>
+      </w:pPr>
+      <w:r>
+        <w:rPr>
+          <w:rFonts w:ascii="Times New Roman" w:hAnsi="Times New Roman" w:eastAsia="Times New Roman"/>
+          <w:b w:val="0"/>
           <w:i/>
           <w:sz w:val="26"/>
         </w:rPr>
-        <w:t>BShoes - Phần mềm quản lý cửa hàng giày, Nhóm 1</w:t>
+        <w:t>Tháng 7 / 2026</w:t>
+      </w:r>
+    </w:p>
+    <w:p>
+      <w:r>
+        <w:br w:type="page"/>
       </w:r>
     </w:p>
     <w:p>
@@ -46,7 +492,7 @@
           <w:color w:val="0B895A"/>
           <w:sz w:val="30"/>
         </w:rPr>
-        <w:t>CHƯƠNG 1: MỤC TIÊU SẢN PHẨM VÀ PRODUCT BACKLOG</w:t>
+        <w:t>CHƯƠNG 1: THÀNH VIÊN NHÓM &amp; VAI TRÒ</w:t>
       </w:r>
     </w:p>
     <w:p>
@@ -60,23 +506,7 @@
           <w:rFonts w:ascii="Times New Roman" w:hAnsi="Times New Roman" w:eastAsia="Times New Roman"/>
           <w:sz w:val="26"/>
         </w:rPr>
-        <w:t>Chương này trả lời hai câu hỏi nền tảng của Workshop 2: sản phẩm BShoes cuối cùng hướng tới điều gì, và Product Backlog tồn tại để phục vụ mục đích gì. Đây là kim chỉ nam để nhóm chấm ưu tiên và ước lượng ở các chương sau.</w:t>
-      </w:r>
-    </w:p>
-    <w:p>
-      <w:pPr>
-        <w:pStyle w:val="Heading2"/>
-        <w:spacing w:lineRule="auto" w:line="312" w:after="120"/>
-        <w:ind w:left="283"/>
-      </w:pPr>
-      <w:r>
-        <w:rPr>
-          <w:rFonts w:ascii="Times New Roman" w:hAnsi="Times New Roman" w:eastAsia="Times New Roman"/>
-          <w:b/>
-          <w:color w:val="0B895A"/>
-          <w:sz w:val="28"/>
-        </w:rPr>
-        <w:t>1.1. Mục tiêu sản phẩm (Product Goal)</w:t>
+        <w:t>Chương này nhắc lại thành viên trực tiếp thực hiện dự án BShoes trong các Sprint, làm rõ ai chịu trách nhiệm chính cho Product Goal, Sprint Goal và Sprint Backlog sẽ trình bày ở các chương tiếp theo.</w:t>
       </w:r>
     </w:p>
     <w:p>
@@ -90,7 +520,93 @@
           <w:rFonts w:ascii="Times New Roman" w:hAnsi="Times New Roman" w:eastAsia="Times New Roman"/>
           <w:sz w:val="26"/>
         </w:rPr>
-        <w:t>Mục tiêu sản phẩm cần được phát biểu ngắn gọn nhưng bao quát toàn bộ giá trị mà BShoes mang lại cho cửa hàng giày, làm định hướng chung cho mọi Sprint.</w:t>
+        <w:t>Nguyễn Đình Dũng, vai trò Product Owner (PO).</w:t>
+      </w:r>
+    </w:p>
+    <w:p>
+      <w:pPr>
+        <w:spacing w:lineRule="auto" w:line="312" w:after="120"/>
+        <w:ind w:left="0"/>
+        <w:jc w:val="both"/>
+      </w:pPr>
+      <w:r>
+        <w:rPr>
+          <w:rFonts w:ascii="Times New Roman" w:hAnsi="Times New Roman" w:eastAsia="Times New Roman"/>
+          <w:sz w:val="26"/>
+        </w:rPr>
+        <w:t>Hoàng Lê Bảo Ngọc, vai trò Scrum Master (SM).</w:t>
+      </w:r>
+    </w:p>
+    <w:p>
+      <w:pPr>
+        <w:spacing w:lineRule="auto" w:line="312" w:after="120"/>
+        <w:ind w:left="0"/>
+        <w:jc w:val="both"/>
+      </w:pPr>
+      <w:r>
+        <w:rPr>
+          <w:rFonts w:ascii="Times New Roman" w:hAnsi="Times New Roman" w:eastAsia="Times New Roman"/>
+          <w:sz w:val="26"/>
+        </w:rPr>
+        <w:t>Lưu Đình Bắc, vai trò Developer (DEV).</w:t>
+      </w:r>
+    </w:p>
+    <w:p>
+      <w:pPr>
+        <w:spacing w:lineRule="auto" w:line="312" w:after="120"/>
+        <w:ind w:left="0"/>
+        <w:jc w:val="both"/>
+      </w:pPr>
+      <w:r>
+        <w:rPr>
+          <w:rFonts w:ascii="Times New Roman" w:hAnsi="Times New Roman" w:eastAsia="Times New Roman"/>
+          <w:sz w:val="26"/>
+        </w:rPr>
+        <w:t>Đỗ Anh Vũ, vai trò Developer (DEV).</w:t>
+      </w:r>
+    </w:p>
+    <w:p>
+      <w:pPr>
+        <w:spacing w:lineRule="auto" w:line="312" w:after="120"/>
+        <w:ind w:left="0"/>
+        <w:jc w:val="both"/>
+      </w:pPr>
+      <w:r>
+        <w:rPr>
+          <w:rFonts w:ascii="Times New Roman" w:hAnsi="Times New Roman" w:eastAsia="Times New Roman"/>
+          <w:sz w:val="26"/>
+        </w:rPr>
+        <w:t>Bốn thành viên này cùng chịu trách nhiệm trước Product Goal của dự án: PO chốt mục tiêu và độ ưu tiên, SM đảm bảo quy trình Scrum được tuân thủ, hai Dev hiện thực hóa mục tiêu đó qua từng Sprint.</w:t>
+      </w:r>
+    </w:p>
+    <w:p>
+      <w:pPr>
+        <w:pStyle w:val="Heading1"/>
+        <w:spacing w:lineRule="auto" w:line="312" w:after="120"/>
+        <w:ind w:left="0"/>
+      </w:pPr>
+      <w:r>
+        <w:rPr>
+          <w:rFonts w:ascii="Times New Roman" w:hAnsi="Times New Roman" w:eastAsia="Times New Roman"/>
+          <w:b/>
+          <w:color w:val="0B895A"/>
+          <w:sz w:val="30"/>
+        </w:rPr>
+        <w:t>CHƯƠNG 2: MỤC TIÊU SẢN PHẨM (PRODUCT GOAL)</w:t>
+      </w:r>
+    </w:p>
+    <w:p>
+      <w:pPr>
+        <w:spacing w:lineRule="auto" w:line="312" w:after="120"/>
+        <w:ind w:left="0"/>
+        <w:jc w:val="both"/>
+      </w:pPr>
+      <w:r>
+        <w:rPr>
+          <w:rFonts w:ascii="Times New Roman" w:hAnsi="Times New Roman" w:eastAsia="Times New Roman"/>
+          <w:sz w:val="26"/>
+        </w:rPr>
+        <w:t>Chương này trả lời câu hỏi nền tảng của Workshop 2: sản phẩm BShoes cuối cùng hướng tới điều gì. Đây là kim chỉ nam để nhóm chấm ưu tiên và ước lượng ở các chương sau.</w:t>
       </w:r>
     </w:p>
     <w:p>
@@ -123,18 +639,18 @@
     </w:p>
     <w:p>
       <w:pPr>
-        <w:pStyle w:val="Heading2"/>
+        <w:pStyle w:val="Heading1"/>
         <w:spacing w:lineRule="auto" w:line="312" w:after="120"/>
-        <w:ind w:left="283"/>
+        <w:ind w:left="0"/>
       </w:pPr>
       <w:r>
         <w:rPr>
           <w:rFonts w:ascii="Times New Roman" w:hAnsi="Times New Roman" w:eastAsia="Times New Roman"/>
           <w:b/>
           <w:color w:val="0B895A"/>
-          <w:sz w:val="28"/>
+          <w:sz w:val="30"/>
         </w:rPr>
-        <w:t>1.2. Mục tiêu của Product Backlog</w:t>
+        <w:t>CHƯƠNG 3: MỤC TIÊU CỦA PRODUCT BACKLOG</w:t>
       </w:r>
     </w:p>
     <w:p>
@@ -192,7 +708,7 @@
           <w:color w:val="0B895A"/>
           <w:sz w:val="30"/>
         </w:rPr>
-        <w:t>CHƯƠNG 2: MỤC TIÊU TỪNG SPRINT</w:t>
+        <w:t>CHƯƠNG 4: DỰ ĐỊNH THỜI LƯỢNG VÀ SỐ LƯỢNG SPRINT</w:t>
       </w:r>
     </w:p>
     <w:p>
@@ -206,7 +722,65 @@
           <w:rFonts w:ascii="Times New Roman" w:hAnsi="Times New Roman" w:eastAsia="Times New Roman"/>
           <w:sz w:val="26"/>
         </w:rPr>
-        <w:t>Chương này trình bày mục tiêu cụ thể của từng Sprint trong số 6 Sprint của dự án, kèm khung thời gian và khối lượng quy đổi ra số user story và Story Points. Đây là cách nhóm chia nhỏ mục tiêu sản phẩm ở chương 1 thành các mốc có thể kiểm chứng theo tuần.</w:t>
+        <w:t>Chương này nhắc lại cam kết về thời lượng dự án làm căn cứ xác định Sprint Goal cho từng Sprint ở chương tiếp theo, đồng thời liên hệ ngược tới kế hoạch chi tiết đã trình bày ở Workshop 1.</w:t>
+      </w:r>
+    </w:p>
+    <w:p>
+      <w:pPr>
+        <w:spacing w:lineRule="auto" w:line="312" w:after="120"/>
+        <w:ind w:left="0"/>
+        <w:jc w:val="both"/>
+      </w:pPr>
+      <w:r>
+        <w:rPr>
+          <w:rFonts w:ascii="Times New Roman" w:hAnsi="Times New Roman" w:eastAsia="Times New Roman"/>
+          <w:sz w:val="26"/>
+        </w:rPr>
+        <w:t>Dự án BShoes dự kiến hoàn thành trong 6 Sprint, mỗi Sprint kéo dài 1 tuần / sprint, bắt đầu từ 01/07/2026 và kết thúc vào 11/08/2026, cộng thêm giai đoạn Bảo vệ để hoàn thiện tài liệu và chuẩn bị bảo vệ. Bảng chi tiết từng Sprint cùng Story Points cộng dồn đã trình bày đầy đủ ở Workshop 1; chương này chỉ nhắc lại khung thời gian để nhóm bám theo khi lập Sprint Goal.</w:t>
+      </w:r>
+    </w:p>
+    <w:p>
+      <w:pPr>
+        <w:spacing w:lineRule="auto" w:line="312" w:after="120"/>
+        <w:ind w:left="0"/>
+        <w:jc w:val="both"/>
+      </w:pPr>
+      <w:r>
+        <w:rPr>
+          <w:rFonts w:ascii="Times New Roman" w:hAnsi="Times New Roman" w:eastAsia="Times New Roman"/>
+          <w:sz w:val="26"/>
+        </w:rPr>
+        <w:t>Trong 6 Sprint này, nhóm chỉ đưa vào 24 Request ở trạng thái New, 16 Request còn lại đã được hoãn sang giai đoạn sau, nên khối lượng mỗi Sprint được giữ ở mức vừa phải với năng lực bốn thành viên.</w:t>
+      </w:r>
+    </w:p>
+    <w:p>
+      <w:pPr>
+        <w:pStyle w:val="Heading1"/>
+        <w:spacing w:lineRule="auto" w:line="312" w:after="120"/>
+        <w:ind w:left="0"/>
+      </w:pPr>
+      <w:r>
+        <w:rPr>
+          <w:rFonts w:ascii="Times New Roman" w:hAnsi="Times New Roman" w:eastAsia="Times New Roman"/>
+          <w:b/>
+          <w:color w:val="0B895A"/>
+          <w:sz w:val="30"/>
+        </w:rPr>
+        <w:t>CHƯƠNG 5: MỤC TIÊU CỤ THỂ CHO TỪNG SPRINT (SPRINT GOALS)</w:t>
+      </w:r>
+    </w:p>
+    <w:p>
+      <w:pPr>
+        <w:spacing w:lineRule="auto" w:line="312" w:after="120"/>
+        <w:ind w:left="0"/>
+        <w:jc w:val="both"/>
+      </w:pPr>
+      <w:r>
+        <w:rPr>
+          <w:rFonts w:ascii="Times New Roman" w:hAnsi="Times New Roman" w:eastAsia="Times New Roman"/>
+          <w:sz w:val="26"/>
+        </w:rPr>
+        <w:t>Chương này trình bày mục tiêu cụ thể của từng Sprint trong số 6 Sprint của dự án, kèm khung thời gian và khối lượng quy đổi ra số user story và Story Points. Đây là cách nhóm chia nhỏ mục tiêu sản phẩm ở chương 2 thành các mốc có thể kiểm chứng theo tuần.</w:t>
       </w:r>
     </w:p>
     <w:p>
@@ -222,7 +796,7 @@
           <w:color w:val="0B895A"/>
           <w:sz w:val="28"/>
         </w:rPr>
-        <w:t>2.1. Sprint 1: PLANNING</w:t>
+        <w:t>5.1. Sprint 1: PLANNING</w:t>
       </w:r>
     </w:p>
     <w:p>
@@ -266,7 +840,7 @@
           <w:color w:val="0B895A"/>
           <w:sz w:val="28"/>
         </w:rPr>
-        <w:t>2.2. Sprint 2: PROTOTYPE</w:t>
+        <w:t>5.2. Sprint 2: PROTOTYPE</w:t>
       </w:r>
     </w:p>
     <w:p>
@@ -310,7 +884,7 @@
           <w:color w:val="0B895A"/>
           <w:sz w:val="28"/>
         </w:rPr>
-        <w:t>2.3. Sprint 3: TEST</w:t>
+        <w:t>5.3. Sprint 3: TEST</w:t>
       </w:r>
     </w:p>
     <w:p>
@@ -354,7 +928,7 @@
           <w:color w:val="0B895A"/>
           <w:sz w:val="28"/>
         </w:rPr>
-        <w:t>2.4. Sprint 4: POLISH</w:t>
+        <w:t>5.4. Sprint 4: POLISH</w:t>
       </w:r>
     </w:p>
     <w:p>
@@ -398,7 +972,7 @@
           <w:color w:val="0B895A"/>
           <w:sz w:val="28"/>
         </w:rPr>
-        <w:t>2.5. Sprint 5: LAUNCH</w:t>
+        <w:t>5.5. Sprint 5: LAUNCH</w:t>
       </w:r>
     </w:p>
     <w:p>
@@ -444,7 +1018,7 @@
           <w:color w:val="0B895A"/>
           <w:sz w:val="28"/>
         </w:rPr>
-        <w:t>2.6. Sprint 6: LAUNCH</w:t>
+        <w:t>5.6. Sprint 6: LAUNCH</w:t>
       </w:r>
     </w:p>
     <w:p>
@@ -502,7 +1076,7 @@
           <w:color w:val="0B895A"/>
           <w:sz w:val="30"/>
         </w:rPr>
-        <w:t>CHƯƠNG 3: PHƯƠNG PHÁP ƯỚC LƯỢNG</w:t>
+        <w:t>CHƯƠNG 6: PHƯƠNG PHÁP ƯỚC LƯỢNG</w:t>
       </w:r>
     </w:p>
     <w:p>
@@ -532,7 +1106,7 @@
           <w:color w:val="0B895A"/>
           <w:sz w:val="28"/>
         </w:rPr>
-        <w:t>3.1. Công thức UP, AP, PPS</w:t>
+        <w:t>6.1. Công thức UP, AP, PPS</w:t>
       </w:r>
     </w:p>
     <w:p>
@@ -685,7 +1259,7 @@
           <w:rFonts w:ascii="Times New Roman" w:hAnsi="Times New Roman" w:eastAsia="Times New Roman"/>
           <w:sz w:val="26"/>
         </w:rPr>
-        <w:t>Ba công thức trên nối tiếp nhau: UP phản ánh độ phức tạp thuần của user story, AP hiệu chỉnh theo hệ số nhân C, còn PPS đưa thêm yếu tố môi trường ED để ra Story Points cuối cùng, dùng thống nhất cho mọi bảng ước lượng ở chương 4.</w:t>
+        <w:t>Ba công thức trên nối tiếp nhau: UP phản ánh độ phức tạp thuần của user story, AP hiệu chỉnh theo hệ số nhân C, còn PPS đưa thêm yếu tố môi trường ED để ra Story Points cuối cùng, dùng thống nhất cho mọi bảng ước lượng ở chương 7.</w:t>
       </w:r>
     </w:p>
     <w:p>
@@ -701,7 +1275,7 @@
           <w:color w:val="0B895A"/>
           <w:sz w:val="28"/>
         </w:rPr>
-        <w:t>3.2. Hệ số môi trường ED và hệ số nhân C của nhóm</w:t>
+        <w:t>6.2. Hệ số môi trường ED và hệ số nhân C của nhóm</w:t>
       </w:r>
     </w:p>
     <w:p>
@@ -764,7 +1338,7 @@
           <w:color w:val="0B895A"/>
           <w:sz w:val="30"/>
         </w:rPr>
-        <w:t>CHƯƠNG 4: BẢNG ƯỚC LƯỢNG USER STORY</w:t>
+        <w:t>CHƯƠNG 7: BẢNG ƯỚC LƯỢNG USER STORY</w:t>
       </w:r>
     </w:p>
     <w:p>
@@ -778,7 +1352,7 @@
           <w:rFonts w:ascii="Times New Roman" w:hAnsi="Times New Roman" w:eastAsia="Times New Roman"/>
           <w:sz w:val="26"/>
         </w:rPr>
-        <w:t>Chương này áp dụng công thức và các tham số ở chương 3 để trình bày Story Points của toàn bộ 40 Request, cùng mức ưu tiên và Business Value tương ứng, làm căn cứ xếp Sprint đã trình bày ở Workshop 1 và chương 2.</w:t>
+        <w:t>Chương này áp dụng công thức và các tham số ở chương 6 để trình bày Story Points của toàn bộ 40 Request, cùng mức ưu tiên và Business Value tương ứng, làm căn cứ xếp Sprint đã trình bày ở Workshop 1 và chương 5.</w:t>
       </w:r>
     </w:p>
     <w:p>
@@ -796,7 +1370,7 @@
           <w:color w:val="0B895A"/>
           <w:sz w:val="24"/>
         </w:rPr>
-        <w:t>Bảng 4.1: Ước lượng Story Point cho từng User Story</w:t>
+        <w:t>Bảng 7.1: Ước lượng Story Point cho từng User Story</w:t>
       </w:r>
     </w:p>
     <w:tbl>
@@ -5622,7 +6196,7 @@
           <w:color w:val="0B895A"/>
           <w:sz w:val="30"/>
         </w:rPr>
-        <w:t>CHƯƠNG 5: SPRINT BACKLOG THEO TỪNG SPRINT</w:t>
+        <w:t>CHƯƠNG 8: SPRINT BACKLOG THEO TỪNG SPRINT</w:t>
       </w:r>
     </w:p>
     <w:p>
@@ -5650,7 +6224,7 @@
           <w:rFonts w:ascii="Times New Roman" w:hAnsi="Times New Roman" w:eastAsia="Times New Roman"/>
           <w:sz w:val="26"/>
         </w:rPr>
-        <w:t>Tổng cộng 92 Task được tách ra từ 13 Product Backlog, với tổng khối lượng 316 giờ công, trải đều trên 6 Sprint. Các bảng dưới đây liệt kê Task theo từng Sprint, đúng theo Sprint đã xếp ở Workshop 1 và chương 2.</w:t>
+        <w:t>Tổng cộng 92 Task được tách ra từ 13 Product Backlog, với tổng khối lượng 316 giờ công, trải đều trên 6 Sprint. Các bảng dưới đây liệt kê Task theo từng Sprint, đúng theo Sprint đã xếp ở Workshop 1 và chương 5.</w:t>
       </w:r>
     </w:p>
     <w:p>
@@ -5667,7 +6241,7 @@
           <w:color w:val="0B895A"/>
           <w:sz w:val="26"/>
         </w:rPr>
-        <w:t>5.1.1. Sprint 1</w:t>
+        <w:t>8.1.1. Sprint 1</w:t>
       </w:r>
     </w:p>
     <w:p>
@@ -5699,7 +6273,7 @@
           <w:color w:val="0B895A"/>
           <w:sz w:val="24"/>
         </w:rPr>
-        <w:t>Bảng 5.1: Sprint Backlog Sprint 1</w:t>
+        <w:t>Bảng 8.1: Sprint Backlog Sprint 1</w:t>
       </w:r>
     </w:p>
     <w:tbl>
@@ -7251,7 +7825,7 @@
           <w:color w:val="0B895A"/>
           <w:sz w:val="26"/>
         </w:rPr>
-        <w:t>5.1.2. Sprint 2</w:t>
+        <w:t>8.1.2. Sprint 2</w:t>
       </w:r>
     </w:p>
     <w:p>
@@ -7283,7 +7857,7 @@
           <w:color w:val="0B895A"/>
           <w:sz w:val="24"/>
         </w:rPr>
-        <w:t>Bảng 5.2: Sprint Backlog Sprint 2</w:t>
+        <w:t>Bảng 8.2: Sprint Backlog Sprint 2</w:t>
       </w:r>
     </w:p>
     <w:tbl>
@@ -9067,7 +9641,7 @@
           <w:color w:val="0B895A"/>
           <w:sz w:val="26"/>
         </w:rPr>
-        <w:t>5.1.3. Sprint 3</w:t>
+        <w:t>8.1.3. Sprint 3</w:t>
       </w:r>
     </w:p>
     <w:p>
@@ -9099,7 +9673,7 @@
           <w:color w:val="0B895A"/>
           <w:sz w:val="24"/>
         </w:rPr>
-        <w:t>Bảng 5.3: Sprint Backlog Sprint 3</w:t>
+        <w:t>Bảng 8.3: Sprint Backlog Sprint 3</w:t>
       </w:r>
     </w:p>
     <w:tbl>
@@ -10655,7 +11229,7 @@
           <w:color w:val="0B895A"/>
           <w:sz w:val="26"/>
         </w:rPr>
-        <w:t>5.1.4. Sprint 4</w:t>
+        <w:t>8.1.4. Sprint 4</w:t>
       </w:r>
     </w:p>
     <w:p>
@@ -10687,7 +11261,7 @@
           <w:color w:val="0B895A"/>
           <w:sz w:val="24"/>
         </w:rPr>
-        <w:t>Bảng 5.4: Sprint Backlog Sprint 4</w:t>
+        <w:t>Bảng 8.4: Sprint Backlog Sprint 4</w:t>
       </w:r>
     </w:p>
     <w:tbl>
@@ -12355,7 +12929,7 @@
           <w:color w:val="0B895A"/>
           <w:sz w:val="26"/>
         </w:rPr>
-        <w:t>5.1.5. Sprint 5</w:t>
+        <w:t>8.1.5. Sprint 5</w:t>
       </w:r>
     </w:p>
     <w:p>
@@ -12387,7 +12961,7 @@
           <w:color w:val="0B895A"/>
           <w:sz w:val="24"/>
         </w:rPr>
-        <w:t>Bảng 5.5: Sprint Backlog Sprint 5</w:t>
+        <w:t>Bảng 8.5: Sprint Backlog Sprint 5</w:t>
       </w:r>
     </w:p>
     <w:tbl>
@@ -14747,7 +15321,7 @@
           <w:color w:val="0B895A"/>
           <w:sz w:val="26"/>
         </w:rPr>
-        <w:t>5.1.6. Sprint 6</w:t>
+        <w:t>8.1.6. Sprint 6</w:t>
       </w:r>
     </w:p>
     <w:p>
@@ -14779,7 +15353,7 @@
           <w:color w:val="0B895A"/>
           <w:sz w:val="24"/>
         </w:rPr>
-        <w:t>Bảng 5.6: Sprint Backlog Sprint 6</w:t>
+        <w:t>Bảng 8.6: Sprint Backlog Sprint 6</w:t>
       </w:r>
     </w:p>
     <w:tbl>
@@ -17485,6 +18059,297 @@
           <w:sz w:val="26"/>
         </w:rPr>
         <w:t>Sprint Backlog cho thấy khối lượng Task lớn nhất rơi vào Sprint 5 và Sprint 6, đúng thời điểm nhóm mở rộng kênh online cho khách và dựng báo cáo doanh thu, trong khi Sprint 1 nhẹ hơn vì chủ yếu là khảo sát và lập kế hoạch. Việc mỗi Task đều trỏ về đúng Product Backlog và Request gốc giúp truy vết công việc xuyên suốt ba cấp RQ, PB, Task mà không bị lệch.</w:t>
+      </w:r>
+    </w:p>
+    <w:p>
+      <w:pPr>
+        <w:pStyle w:val="Heading1"/>
+        <w:spacing w:lineRule="auto" w:line="312" w:after="120"/>
+        <w:ind w:left="0"/>
+      </w:pPr>
+      <w:r>
+        <w:rPr>
+          <w:rFonts w:ascii="Times New Roman" w:hAnsi="Times New Roman" w:eastAsia="Times New Roman"/>
+          <w:b/>
+          <w:color w:val="0B895A"/>
+          <w:sz w:val="30"/>
+        </w:rPr>
+        <w:t>CHƯƠNG 9: BIÊN BẢN CUỘC HỌP (SPRINT PLANNING)</w:t>
+      </w:r>
+    </w:p>
+    <w:p>
+      <w:pPr>
+        <w:spacing w:lineRule="auto" w:line="312" w:after="120"/>
+        <w:ind w:left="0"/>
+        <w:jc w:val="both"/>
+      </w:pPr>
+      <w:r>
+        <w:rPr>
+          <w:rFonts w:ascii="Times New Roman" w:hAnsi="Times New Roman" w:eastAsia="Times New Roman"/>
+          <w:sz w:val="26"/>
+        </w:rPr>
+        <w:t>Thời gian: 20:00 - 21:30, ngày 15/07/2026.</w:t>
+      </w:r>
+    </w:p>
+    <w:p>
+      <w:pPr>
+        <w:spacing w:lineRule="auto" w:line="312" w:after="120"/>
+        <w:ind w:left="0"/>
+        <w:jc w:val="both"/>
+      </w:pPr>
+      <w:r>
+        <w:rPr>
+          <w:rFonts w:ascii="Times New Roman" w:hAnsi="Times New Roman" w:eastAsia="Times New Roman"/>
+          <w:sz w:val="26"/>
+        </w:rPr>
+        <w:t>Địa điểm: Google Meet.</w:t>
+      </w:r>
+    </w:p>
+    <w:p>
+      <w:pPr>
+        <w:pStyle w:val="Heading2"/>
+        <w:spacing w:lineRule="auto" w:line="312" w:after="120"/>
+        <w:ind w:left="283"/>
+      </w:pPr>
+      <w:r>
+        <w:rPr>
+          <w:rFonts w:ascii="Times New Roman" w:hAnsi="Times New Roman" w:eastAsia="Times New Roman"/>
+          <w:b/>
+          <w:color w:val="0B895A"/>
+          <w:sz w:val="28"/>
+        </w:rPr>
+        <w:t>9.1. Thành viên tham gia</w:t>
+      </w:r>
+    </w:p>
+    <w:p>
+      <w:pPr>
+        <w:spacing w:lineRule="auto" w:line="312" w:after="120"/>
+        <w:ind w:left="0"/>
+        <w:jc w:val="both"/>
+      </w:pPr>
+      <w:r>
+        <w:rPr>
+          <w:rFonts w:ascii="Times New Roman" w:hAnsi="Times New Roman" w:eastAsia="Times New Roman"/>
+          <w:sz w:val="26"/>
+        </w:rPr>
+        <w:t>Nguyễn Đình Dũng (PO)</w:t>
+      </w:r>
+    </w:p>
+    <w:p>
+      <w:pPr>
+        <w:spacing w:lineRule="auto" w:line="312" w:after="120"/>
+        <w:ind w:left="0"/>
+        <w:jc w:val="both"/>
+      </w:pPr>
+      <w:r>
+        <w:rPr>
+          <w:rFonts w:ascii="Times New Roman" w:hAnsi="Times New Roman" w:eastAsia="Times New Roman"/>
+          <w:sz w:val="26"/>
+        </w:rPr>
+        <w:t>Hoàng Lê Bảo Ngọc (SM)</w:t>
+      </w:r>
+    </w:p>
+    <w:p>
+      <w:pPr>
+        <w:spacing w:lineRule="auto" w:line="312" w:after="120"/>
+        <w:ind w:left="0"/>
+        <w:jc w:val="both"/>
+      </w:pPr>
+      <w:r>
+        <w:rPr>
+          <w:rFonts w:ascii="Times New Roman" w:hAnsi="Times New Roman" w:eastAsia="Times New Roman"/>
+          <w:sz w:val="26"/>
+        </w:rPr>
+        <w:t>Lưu Đình Bắc (DEV)</w:t>
+      </w:r>
+    </w:p>
+    <w:p>
+      <w:pPr>
+        <w:spacing w:lineRule="auto" w:line="312" w:after="120"/>
+        <w:ind w:left="0"/>
+        <w:jc w:val="both"/>
+      </w:pPr>
+      <w:r>
+        <w:rPr>
+          <w:rFonts w:ascii="Times New Roman" w:hAnsi="Times New Roman" w:eastAsia="Times New Roman"/>
+          <w:sz w:val="26"/>
+        </w:rPr>
+        <w:t>Đỗ Anh Vũ (DEV)</w:t>
+      </w:r>
+    </w:p>
+    <w:p>
+      <w:pPr>
+        <w:pStyle w:val="Heading2"/>
+        <w:spacing w:lineRule="auto" w:line="312" w:after="120"/>
+        <w:ind w:left="283"/>
+      </w:pPr>
+      <w:r>
+        <w:rPr>
+          <w:rFonts w:ascii="Times New Roman" w:hAnsi="Times New Roman" w:eastAsia="Times New Roman"/>
+          <w:b/>
+          <w:color w:val="0B895A"/>
+          <w:sz w:val="28"/>
+        </w:rPr>
+        <w:t>9.2. Nội dung cuộc họp</w:t>
+      </w:r>
+    </w:p>
+    <w:p>
+      <w:pPr>
+        <w:spacing w:lineRule="auto" w:line="312" w:after="120"/>
+        <w:ind w:left="907"/>
+      </w:pPr>
+      <w:r>
+        <w:rPr>
+          <w:rFonts w:ascii="Times New Roman" w:hAnsi="Times New Roman" w:eastAsia="Times New Roman"/>
+          <w:sz w:val="26"/>
+        </w:rPr>
+        <w:t>- Rà soát và thống nhất Product Backlog đã xây dựng trong Workshop 1.</w:t>
+      </w:r>
+    </w:p>
+    <w:p>
+      <w:pPr>
+        <w:spacing w:lineRule="auto" w:line="312" w:after="120"/>
+        <w:ind w:left="907"/>
+      </w:pPr>
+      <w:r>
+        <w:rPr>
+          <w:rFonts w:ascii="Times New Roman" w:hAnsi="Times New Roman" w:eastAsia="Times New Roman"/>
+          <w:sz w:val="26"/>
+        </w:rPr>
+        <w:t>- Thống nhất Product Goal và Product Backlog Goal của dự án BShoes.</w:t>
+      </w:r>
+    </w:p>
+    <w:p>
+      <w:pPr>
+        <w:spacing w:lineRule="auto" w:line="312" w:after="120"/>
+        <w:ind w:left="907"/>
+      </w:pPr>
+      <w:r>
+        <w:rPr>
+          <w:rFonts w:ascii="Times New Roman" w:hAnsi="Times New Roman" w:eastAsia="Times New Roman"/>
+          <w:sz w:val="26"/>
+        </w:rPr>
+        <w:t>- Xác định Sprint Goal cho 6 Sprint dựa trên lộ trình phát triển của dự án.</w:t>
+      </w:r>
+    </w:p>
+    <w:p>
+      <w:pPr>
+        <w:spacing w:lineRule="auto" w:line="312" w:after="120"/>
+        <w:ind w:left="907"/>
+      </w:pPr>
+      <w:r>
+        <w:rPr>
+          <w:rFonts w:ascii="Times New Roman" w:hAnsi="Times New Roman" w:eastAsia="Times New Roman"/>
+          <w:sz w:val="26"/>
+        </w:rPr>
+        <w:t>- Phân bổ 24 Request trạng thái New từ Product Backlog vào 6 Sprint theo mẫu Sprint Planning chuẩn.</w:t>
+      </w:r>
+    </w:p>
+    <w:p>
+      <w:pPr>
+        <w:spacing w:lineRule="auto" w:line="312" w:after="120"/>
+        <w:ind w:left="907"/>
+      </w:pPr>
+      <w:r>
+        <w:rPr>
+          <w:rFonts w:ascii="Times New Roman" w:hAnsi="Times New Roman" w:eastAsia="Times New Roman"/>
+          <w:sz w:val="26"/>
+        </w:rPr>
+        <w:t>- Thống nhất chuyển 16 Request còn lại sang trạng thái Removed cho giai đoạn sau.</w:t>
+      </w:r>
+    </w:p>
+    <w:p>
+      <w:pPr>
+        <w:spacing w:lineRule="auto" w:line="312" w:after="120"/>
+        <w:ind w:left="907"/>
+      </w:pPr>
+      <w:r>
+        <w:rPr>
+          <w:rFonts w:ascii="Times New Roman" w:hAnsi="Times New Roman" w:eastAsia="Times New Roman"/>
+          <w:sz w:val="26"/>
+        </w:rPr>
+        <w:t>- Phân rã các User Story thành các Task kỹ thuật để hình thành Sprint Backlog chi tiết.</w:t>
+      </w:r>
+    </w:p>
+    <w:p>
+      <w:pPr>
+        <w:spacing w:lineRule="auto" w:line="312" w:after="120"/>
+        <w:ind w:left="907"/>
+      </w:pPr>
+      <w:r>
+        <w:rPr>
+          <w:rFonts w:ascii="Times New Roman" w:hAnsi="Times New Roman" w:eastAsia="Times New Roman"/>
+          <w:sz w:val="26"/>
+        </w:rPr>
+        <w:t>- Phân công công việc giữa các thành viên, bao gồm các Task đặc trưng của Product Owner.</w:t>
+      </w:r>
+    </w:p>
+    <w:p>
+      <w:pPr>
+        <w:pStyle w:val="Heading2"/>
+        <w:spacing w:lineRule="auto" w:line="312" w:after="120"/>
+        <w:ind w:left="283"/>
+      </w:pPr>
+      <w:r>
+        <w:rPr>
+          <w:rFonts w:ascii="Times New Roman" w:hAnsi="Times New Roman" w:eastAsia="Times New Roman"/>
+          <w:b/>
+          <w:color w:val="0B895A"/>
+          <w:sz w:val="28"/>
+        </w:rPr>
+        <w:t>9.3. Kết quả cuộc họp</w:t>
+      </w:r>
+    </w:p>
+    <w:p>
+      <w:pPr>
+        <w:spacing w:lineRule="auto" w:line="312" w:after="120"/>
+        <w:ind w:left="907"/>
+      </w:pPr>
+      <w:r>
+        <w:rPr>
+          <w:rFonts w:ascii="Times New Roman" w:hAnsi="Times New Roman" w:eastAsia="Times New Roman"/>
+          <w:sz w:val="26"/>
+        </w:rPr>
+        <w:t>- Thống nhất Product Goal, Product Backlog Goal và Sprint Goal cho 6 Sprint.</w:t>
+      </w:r>
+    </w:p>
+    <w:p>
+      <w:pPr>
+        <w:spacing w:lineRule="auto" w:line="312" w:after="120"/>
+        <w:ind w:left="907"/>
+      </w:pPr>
+      <w:r>
+        <w:rPr>
+          <w:rFonts w:ascii="Times New Roman" w:hAnsi="Times New Roman" w:eastAsia="Times New Roman"/>
+          <w:sz w:val="26"/>
+        </w:rPr>
+        <w:t>- Hoàn thành Sprint Planning theo đúng mẫu Sprint Backlog do giảng viên cung cấp.</w:t>
+      </w:r>
+    </w:p>
+    <w:p>
+      <w:pPr>
+        <w:spacing w:lineRule="auto" w:line="312" w:after="120"/>
+        <w:ind w:left="907"/>
+      </w:pPr>
+      <w:r>
+        <w:rPr>
+          <w:rFonts w:ascii="Times New Roman" w:hAnsi="Times New Roman" w:eastAsia="Times New Roman"/>
+          <w:sz w:val="26"/>
+        </w:rPr>
+        <w:t>- Hoàn thành Sprint Backlog chi tiết với Task kỹ thuật, thời gian ước lượng và người thực hiện.</w:t>
+      </w:r>
+    </w:p>
+    <w:p>
+      <w:pPr>
+        <w:spacing w:lineRule="auto" w:line="312" w:after="120"/>
+        <w:ind w:left="907"/>
+      </w:pPr>
+      <w:r>
+        <w:rPr>
+          <w:rFonts w:ascii="Times New Roman" w:hAnsi="Times New Roman" w:eastAsia="Times New Roman"/>
+          <w:sz w:val="26"/>
+        </w:rPr>
+        <w:t>- Thống nhất tiếp tục triển khai dự án theo kế hoạch trong các Workshop tiếp theo.</w:t>
       </w:r>
     </w:p>
     <w:p>

</xml_diff>